<commit_message>
Quartz sync: Nov 3, 2025, 12:52 PM
</commit_message>
<xml_diff>
--- a/content/Notes/Biology/Labs/Lab 06/Lab 07/Doc1.docx
+++ b/content/Notes/Biology/Labs/Lab 06/Lab 07/Doc1.docx
@@ -2,6 +2,306 @@
 <file path=word/document.xml><?xml version="1.0" encoding="utf-8"?>
 <w:document xmlns:wpc="http://schemas.microsoft.com/office/word/2010/wordprocessingCanvas" xmlns:cx="http://schemas.microsoft.com/office/drawing/2014/chartex" xmlns:cx1="http://schemas.microsoft.com/office/drawing/2015/9/8/chartex" xmlns:cx2="http://schemas.microsoft.com/office/drawing/2015/10/21/chartex" xmlns:cx3="http://schemas.microsoft.com/office/drawing/2016/5/9/chartex" xmlns:cx4="http://schemas.microsoft.com/office/drawing/2016/5/10/chartex" xmlns:cx5="http://schemas.microsoft.com/office/drawing/2016/5/11/chartex" xmlns:cx6="http://schemas.microsoft.com/office/drawing/2016/5/12/chartex" xmlns:cx7="http://schemas.microsoft.com/office/drawing/2016/5/13/chartex" xmlns:cx8="http://schemas.microsoft.com/office/drawing/2016/5/14/chartex" xmlns:mc="http://schemas.openxmlformats.org/markup-compatibility/2006" xmlns:aink="http://schemas.microsoft.com/office/drawing/2016/ink" xmlns:am3d="http://schemas.microsoft.com/office/drawing/2017/model3d" xmlns:o="urn:schemas-microsoft-com:office:office" xmlns:oel="http://schemas.microsoft.com/office/2019/extlst" xmlns:r="http://schemas.openxmlformats.org/officeDocument/2006/relationships" xmlns:m="http://schemas.openxmlformats.org/officeDocument/2006/math" xmlns:v="urn:schemas-microsoft-com:vml" xmlns:wp14="http://schemas.microsoft.com/office/word/2010/wordprocessingDrawing" xmlns:wp="http://schemas.openxmlformats.org/drawingml/2006/wordprocessingDrawing" xmlns:w10="urn:schemas-microsoft-com:office:word" xmlns:w="http://schemas.openxmlformats.org/wordprocessingml/2006/main" xmlns:w14="http://schemas.microsoft.com/office/word/2010/wordml" xmlns:w15="http://schemas.microsoft.com/office/word/2012/wordml" xmlns:w16cex="http://schemas.microsoft.com/office/word/2018/wordml/cex" xmlns:w16cid="http://schemas.microsoft.com/office/word/2016/wordml/cid" xmlns:w16="http://schemas.microsoft.com/office/word/2018/wordml" xmlns:w16du="http://schemas.microsoft.com/office/word/2023/wordml/word16du" xmlns:w16sdtdh="http://schemas.microsoft.com/office/word/2020/wordml/sdtdatahash" xmlns:w16sdtfl="http://schemas.microsoft.com/office/word/2024/wordml/sdtformatlock" xmlns:w16se="http://schemas.microsoft.com/office/word/2015/wordml/symex" xmlns:wpg="http://schemas.microsoft.com/office/word/2010/wordprocessingGroup" xmlns:wpi="http://schemas.microsoft.com/office/word/2010/wordprocessingInk" xmlns:wne="http://schemas.microsoft.com/office/word/2006/wordml" xmlns:wps="http://schemas.microsoft.com/office/word/2010/wordprocessingShape" mc:Ignorable="w14 w15 w16se w16cid w16 w16cex w16sdtdh w16sdtfl w16du wp14">
   <w:body>
+    <w:p>
+      <w:pPr>
+        <w:rPr>
+          <w:b/>
+          <w:bCs/>
+        </w:rPr>
+      </w:pPr>
+      <w:r>
+        <w:rPr>
+          <w:b/>
+          <w:bCs/>
+        </w:rPr>
+        <w:t>Ewan Pedersen</w:t>
+      </w:r>
+    </w:p>
+    <w:p/>
+    <w:p/>
+    <w:p>
+      <w:r>
+        <w:rPr>
+          <w:b/>
+          <w:bCs/>
+        </w:rPr>
+        <w:t>Hypothesis</w:t>
+      </w:r>
+      <w:r>
+        <w:t>: Glucose at a 10% concentration yields a greater fermentation rate than glucose at a 2.5% concentration.</w:t>
+      </w:r>
+    </w:p>
+    <w:p/>
+    <w:p>
+      <w:pPr>
+        <w:rPr>
+          <w:b/>
+          <w:bCs/>
+        </w:rPr>
+      </w:pPr>
+      <w:r>
+        <w:rPr>
+          <w:b/>
+          <w:bCs/>
+        </w:rPr>
+        <w:t xml:space="preserve">Methods: </w:t>
+      </w:r>
+    </w:p>
+    <w:p>
+      <w:r>
+        <w:t xml:space="preserve">Our experiment was set up with 4 replicates at 4 different time intervals, and two concentrations at 2.5% and 10%. Each concentration experiment was prepared by first adding 0.800 </w:t>
+      </w:r>
+      <w:proofErr w:type="spellStart"/>
+      <w:r>
+        <w:t>mLs</w:t>
+      </w:r>
+      <w:proofErr w:type="spellEnd"/>
+      <w:r>
+        <w:t xml:space="preserve"> of the 10% glucose concentration to each tube (4 replicates x 4 intervals = 16 tubes). A 1000 mL beaker with 750 mL of 40 C water is carefully prepared and checked with a thermometer. Then, each tube </w:t>
+      </w:r>
+      <w:r>
+        <w:t xml:space="preserve">quickly </w:t>
+      </w:r>
+      <w:r>
+        <w:t xml:space="preserve">gets 0.800 </w:t>
+      </w:r>
+      <w:proofErr w:type="spellStart"/>
+      <w:r>
+        <w:t>mLs</w:t>
+      </w:r>
+      <w:proofErr w:type="spellEnd"/>
+      <w:r>
+        <w:t xml:space="preserve"> of the 3% yeast concentration added </w:t>
+      </w:r>
+      <w:proofErr w:type="spellStart"/>
+      <w:r>
+        <w:t>tol</w:t>
+      </w:r>
+      <w:proofErr w:type="spellEnd"/>
+      <w:r>
+        <w:t xml:space="preserve"> the glucose mixture in each tube, which are then </w:t>
+      </w:r>
+      <w:r>
+        <w:t xml:space="preserve">weighed, </w:t>
+      </w:r>
+      <w:r>
+        <w:t>sealed quickly</w:t>
+      </w:r>
+      <w:r>
+        <w:t>,</w:t>
+      </w:r>
+      <w:r>
+        <w:t xml:space="preserve"> and inserted into the water bath. At each time interval, 4 tubes are removed </w:t>
+      </w:r>
+      <w:r>
+        <w:t xml:space="preserve">with one from each </w:t>
+      </w:r>
+      <w:proofErr w:type="spellStart"/>
+      <w:r>
+        <w:t>repliacate</w:t>
+      </w:r>
+      <w:proofErr w:type="spellEnd"/>
+      <w:r>
+        <w:t xml:space="preserve"> for that time. It is then weighed to deduce a net weight loss, with measurements and temperature recorded. This is then repeated for the 2.5% concentration.</w:t>
+      </w:r>
+    </w:p>
+    <w:p>
+      <w:pPr>
+        <w:rPr>
+          <w:b/>
+          <w:bCs/>
+        </w:rPr>
+      </w:pPr>
+    </w:p>
+    <w:p>
+      <w:pPr>
+        <w:rPr>
+          <w:b/>
+          <w:bCs/>
+        </w:rPr>
+      </w:pPr>
+      <w:r>
+        <w:rPr>
+          <w:b/>
+          <w:bCs/>
+        </w:rPr>
+        <w:t>Results</w:t>
+      </w:r>
+      <w:r>
+        <w:rPr>
+          <w:b/>
+          <w:bCs/>
+        </w:rPr>
+        <w:t>:</w:t>
+      </w:r>
+    </w:p>
+    <w:p>
+      <w:pPr>
+        <w:rPr>
+          <w:b/>
+          <w:bCs/>
+        </w:rPr>
+      </w:pPr>
+      <w:r>
+        <w:rPr>
+          <w:b/>
+          <w:bCs/>
+        </w:rPr>
+        <w:lastRenderedPageBreak/>
+        <w:drawing>
+          <wp:inline distT="0" distB="0" distL="0" distR="0" wp14:anchorId="51F866F8" wp14:editId="34171853">
+            <wp:extent cx="5943600" cy="4309745"/>
+            <wp:effectExtent l="0" t="0" r="0" b="0"/>
+            <wp:docPr id="2017368420" name="Picture 1"/>
+            <wp:cNvGraphicFramePr>
+              <a:graphicFrameLocks xmlns:a="http://schemas.openxmlformats.org/drawingml/2006/main" noChangeAspect="1"/>
+            </wp:cNvGraphicFramePr>
+            <a:graphic xmlns:a="http://schemas.openxmlformats.org/drawingml/2006/main">
+              <a:graphicData uri="http://schemas.openxmlformats.org/drawingml/2006/picture">
+                <pic:pic xmlns:pic="http://schemas.openxmlformats.org/drawingml/2006/picture">
+                  <pic:nvPicPr>
+                    <pic:cNvPr id="2017368420" name=""/>
+                    <pic:cNvPicPr/>
+                  </pic:nvPicPr>
+                  <pic:blipFill>
+                    <a:blip r:embed="rId4"/>
+                    <a:stretch>
+                      <a:fillRect/>
+                    </a:stretch>
+                  </pic:blipFill>
+                  <pic:spPr>
+                    <a:xfrm>
+                      <a:off x="0" y="0"/>
+                      <a:ext cx="5943600" cy="4309745"/>
+                    </a:xfrm>
+                    <a:prstGeom prst="rect">
+                      <a:avLst/>
+                    </a:prstGeom>
+                  </pic:spPr>
+                </pic:pic>
+              </a:graphicData>
+            </a:graphic>
+          </wp:inline>
+        </w:drawing>
+      </w:r>
+    </w:p>
+    <w:p>
+      <w:pPr>
+        <w:rPr>
+          <w:i/>
+          <w:iCs/>
+        </w:rPr>
+      </w:pPr>
+      <w:r>
+        <w:rPr>
+          <w:i/>
+          <w:iCs/>
+        </w:rPr>
+        <w:t xml:space="preserve">Figure 1: </w:t>
+      </w:r>
+      <w:proofErr w:type="spellStart"/>
+      <w:r>
+        <w:rPr>
+          <w:i/>
+          <w:iCs/>
+        </w:rPr>
+        <w:t>Comparrison</w:t>
+      </w:r>
+      <w:proofErr w:type="spellEnd"/>
+      <w:r>
+        <w:rPr>
+          <w:i/>
+          <w:iCs/>
+        </w:rPr>
+        <w:t xml:space="preserve"> of average fermentation rate for each concentration, in </w:t>
+      </w:r>
+      <w:r>
+        <w:rPr>
+          <w:i/>
+          <w:iCs/>
+        </w:rPr>
+        <w:t>mL CO2/min</w:t>
+      </w:r>
+      <w:r>
+        <w:rPr>
+          <w:i/>
+          <w:iCs/>
+        </w:rPr>
+        <w:t>)</w:t>
+      </w:r>
+    </w:p>
+    <w:p>
+      <w:pPr>
+        <w:rPr>
+          <w:i/>
+          <w:iCs/>
+        </w:rPr>
+      </w:pPr>
+    </w:p>
+    <w:p>
+      <w:pPr>
+        <w:rPr>
+          <w:i/>
+          <w:iCs/>
+        </w:rPr>
+      </w:pPr>
+      <w:r>
+        <w:rPr>
+          <w:i/>
+          <w:iCs/>
+        </w:rPr>
+        <w:t xml:space="preserve">A t-test was performed comparing the varying glucose concentrations to the provided control group. This yielded a p-value of 0.42 for the 10% concentration, and 0.01 for the 2.5% concentration. We concluded that the 10% solution yielded a </w:t>
+      </w:r>
+      <w:r>
+        <w:rPr>
+          <w:b/>
+          <w:bCs/>
+          <w:i/>
+          <w:iCs/>
+        </w:rPr>
+        <w:t>statistically significant result</w:t>
+      </w:r>
+      <w:r>
+        <w:rPr>
+          <w:i/>
+          <w:iCs/>
+        </w:rPr>
+        <w:t>.</w:t>
+      </w:r>
+    </w:p>
+    <w:p>
+      <w:pPr>
+        <w:rPr>
+          <w:i/>
+          <w:iCs/>
+        </w:rPr>
+      </w:pPr>
+    </w:p>
+    <w:p>
+      <w:r>
+        <w:rPr>
+          <w:b/>
+          <w:bCs/>
+        </w:rPr>
+        <w:t>Conclusions</w:t>
+      </w:r>
+      <w:r>
+        <w:t>:</w:t>
+      </w:r>
+    </w:p>
+    <w:p>
+      <w:pPr>
+        <w:rPr>
+          <w:i/>
+          <w:iCs/>
+        </w:rPr>
+      </w:pPr>
+    </w:p>
+    <w:p>
+      <w:r>
+        <w:t>While we did get a statistically significant result for the first trial at 10%, this offers conflicting evidence with our initial hypothesis. We hypothesized that the 10% concentration would yield a greater fermentation rate over the 2.5%, but instead found the opposite given the evidence. For this reason, we reject our hypothesis and accept the null.</w:t>
+      </w:r>
+    </w:p>
     <w:p/>
     <w:sectPr>
       <w:pgSz w:w="12240" w:h="15840"/>

</xml_diff>